<commit_message>
Bổ sung dữ liệu SellerSprite Best Seller vào Phần 1–2
- Mục 1.1.2 mới: doanh số top 100 Best Seller theo tháng (Q4 gấp ~1,9 lần Q3, Q1 ~70% Q4)
- Bảng chuẩn Best Seller và vị trí SIXDO ở 1.2.3 (giá, review, A+/video, sản phẩm mới)
- Cập nhật báo cáo chấm điểm (v4: 36,5/42)

Co-Authored-By: Claude Opus 5.5 <noreply@anthropic.com>
Claude-Session: https://claude.ai/code/session_01WsNB12Yze1HCg9Untvx6SZ
</commit_message>
<xml_diff>
--- a/phan-1-2/SIXDO_Phan1_2_ToiUu.docx
+++ b/phan-1-2/SIXDO_Phan1_2_ToiUu.docx
@@ -262,6 +262,31 @@
             </w:r>
             <w:r>
               <w:t xml:space="preserve"> “Tôi không cần một chiếc váy Giáng sinh. Tôi cần một chiếc váy khoác blazer đi tiệc tháng 12, rồi cởi blazer ra đi brunch tháng 4.” Đồ tiệc mùa lễ là đồ một mùa; váy Xuân/Hè của SIXDO thì mặc tiếp được. Đây là lý do mua mới cho hàng trái mùa.</w:t>
+            </w:r>
+          </w:p>
+          <w:p>
+            <w:pPr>
+              <w:spacing w:after="60" w:line="264"/>
+            </w:pPr>
+            <w:r>
+              <w:rPr>
+                <w:b/>
+                <w:bCs/>
+              </w:rPr>
+              <w:t xml:space="preserve">Doanh số thật trên Amazon:</w:t>
+            </w:r>
+            <w:r>
+              <w:t xml:space="preserve"> top 100 Best Seller Amazon US (thời trang nữ) bán </w:t>
+            </w:r>
+            <w:r>
+              <w:rPr>
+                <w:b/>
+                <w:bCs/>
+              </w:rPr>
+              <w:t xml:space="preserve">gấp khoảng 1,9 lần</w:t>
+            </w:r>
+            <w:r>
+              <w:t xml:space="preserve"> trong Q4/2025 so với Q3, và Q1/2026 còn khoảng 70% Q4 (SellerSprite, ước tính). 91% doanh số của nhóm này thuộc về listing có cả A+ và video.</w:t>
             </w:r>
           </w:p>
           <w:p>
@@ -1514,7 +1539,7 @@
         <w:pStyle w:val="Heading3"/>
       </w:pPr>
       <w:r>
-        <w:t xml:space="preserve">1.1.2 Nhu cầu tìm kiếm theo mùa: “mùa hè” mất sức hút, “dịp” và “đặc tính” lên ngôi</w:t>
+        <w:t xml:space="preserve">1.1.2 Doanh số trên Amazon: Q4 gấp khoảng 1,9 lần Q3, Q1 còn khoảng 70% Q4</w:t>
       </w:r>
     </w:p>
     <w:p>
@@ -1525,7 +1550,7 @@
       <w:r>
         <w:drawing>
           <wp:inline distT="0" distB="0" distL="0" distR="0">
-            <wp:extent cx="5905500" cy="2457450"/>
+            <wp:extent cx="5905500" cy="2543175"/>
             <wp:effectExtent t="0" r="0" b="0" l="0"/>
             <wp:docPr id="1" name="" descr="" title=""/>
             <wp:cNvGraphicFramePr>
@@ -1542,6 +1567,651 @@
                   </pic:nvPicPr>
                   <pic:blipFill>
                     <a:blip r:embed="rId8" cstate="none"/>
+                    <a:srcRect/>
+                    <a:stretch>
+                      <a:fillRect/>
+                    </a:stretch>
+                  </pic:blipFill>
+                  <pic:spPr bwMode="auto">
+                    <a:xfrm>
+                      <a:off x="0" y="0"/>
+                      <a:ext cx="5905500" cy="2543175"/>
+                    </a:xfrm>
+                    <a:prstGeom prst="rect">
+                      <a:avLst/>
+                    </a:prstGeom>
+                  </pic:spPr>
+                </pic:pic>
+              </a:graphicData>
+            </a:graphic>
+          </wp:inline>
+        </w:drawing>
+      </w:r>
+    </w:p>
+    <w:p>
+      <w:pPr>
+        <w:spacing w:after="160" w:before="40"/>
+      </w:pPr>
+      <w:r>
+        <w:rPr>
+          <w:i/>
+          <w:iCs/>
+          <w:color w:val="595959"/>
+          <w:sz w:val="17"/>
+          <w:szCs w:val="17"/>
+        </w:rPr>
+        <w:t xml:space="preserve">Hình 1. Doanh số ước tính theo tháng của 100 sản phẩm đang nằm trong top Best Seller Amazon US (SellerSprite, xuất 09/2026). Báo cáo không ghi danh mục; theo danh sách thương hiệu (Gloria Vanderbilt, PRETTYGARDEN, Kendra Scott…), đây là thời trang nữ nói chung, không riêng váy. Số đọc từ biểu đồ, làm tròn đến nghìn. Dữ liệu nhóm.</w:t>
+      </w:r>
+    </w:p>
+    <w:tbl>
+      <w:tblPr>
+        <w:tblW w:type="dxa" w:w="10080"/>
+        <w:tblBorders>
+          <w:top w:val="single" w:color="auto" w:sz="4"/>
+          <w:left w:val="single" w:color="auto" w:sz="4"/>
+          <w:bottom w:val="single" w:color="auto" w:sz="4"/>
+          <w:right w:val="single" w:color="auto" w:sz="4"/>
+          <w:insideH w:val="single" w:color="auto" w:sz="4"/>
+          <w:insideV w:val="single" w:color="auto" w:sz="4"/>
+        </w:tblBorders>
+      </w:tblPr>
+      <w:tblGrid>
+        <w:gridCol w:w="2621"/>
+        <w:gridCol w:w="2419"/>
+        <w:gridCol w:w="5040"/>
+      </w:tblGrid>
+      <w:tr>
+        <w:trPr>
+          <w:tblHeader/>
+        </w:trPr>
+        <w:tc>
+          <w:tcPr>
+            <w:tcW w:type="dxa" w:w="2621"/>
+            <w:tcBorders>
+              <w:top w:val="single" w:color="C9D1D9" w:sz="4"/>
+              <w:left w:val="single" w:color="C9D1D9" w:sz="4"/>
+              <w:bottom w:val="single" w:color="C9D1D9" w:sz="4"/>
+              <w:right w:val="single" w:color="C9D1D9" w:sz="4"/>
+            </w:tcBorders>
+            <w:shd w:fill="E7EDF3" w:color="auto" w:val="clear"/>
+            <w:tcMar>
+              <w:top w:type="dxa" w:w="60"/>
+              <w:left w:type="dxa" w:w="100"/>
+              <w:bottom w:type="dxa" w:w="60"/>
+              <w:right w:type="dxa" w:w="100"/>
+            </w:tcMar>
+          </w:tcPr>
+          <w:p>
+            <w:pPr>
+              <w:spacing w:after="20" w:line="250"/>
+            </w:pPr>
+            <w:r>
+              <w:rPr>
+                <w:b/>
+                <w:bCs/>
+                <w:color w:val="1F3864"/>
+                <w:sz w:val="18"/>
+                <w:szCs w:val="18"/>
+              </w:rPr>
+              <w:t xml:space="preserve">Giai đoạn</w:t>
+            </w:r>
+          </w:p>
+        </w:tc>
+        <w:tc>
+          <w:tcPr>
+            <w:tcW w:type="dxa" w:w="2419"/>
+            <w:tcBorders>
+              <w:top w:val="single" w:color="C9D1D9" w:sz="4"/>
+              <w:left w:val="single" w:color="C9D1D9" w:sz="4"/>
+              <w:bottom w:val="single" w:color="C9D1D9" w:sz="4"/>
+              <w:right w:val="single" w:color="C9D1D9" w:sz="4"/>
+            </w:tcBorders>
+            <w:shd w:fill="E7EDF3" w:color="auto" w:val="clear"/>
+            <w:tcMar>
+              <w:top w:type="dxa" w:w="60"/>
+              <w:left w:type="dxa" w:w="100"/>
+              <w:bottom w:type="dxa" w:w="60"/>
+              <w:right w:type="dxa" w:w="100"/>
+            </w:tcMar>
+          </w:tcPr>
+          <w:p>
+            <w:pPr>
+              <w:spacing w:after="20" w:line="250"/>
+            </w:pPr>
+            <w:r>
+              <w:rPr>
+                <w:b/>
+                <w:bCs/>
+                <w:color w:val="1F3864"/>
+                <w:sz w:val="18"/>
+                <w:szCs w:val="18"/>
+              </w:rPr>
+              <w:t xml:space="preserve">Sản phẩm bán (ước tính)</w:t>
+            </w:r>
+          </w:p>
+        </w:tc>
+        <w:tc>
+          <w:tcPr>
+            <w:tcW w:type="dxa" w:w="5040"/>
+            <w:tcBorders>
+              <w:top w:val="single" w:color="C9D1D9" w:sz="4"/>
+              <w:left w:val="single" w:color="C9D1D9" w:sz="4"/>
+              <w:bottom w:val="single" w:color="C9D1D9" w:sz="4"/>
+              <w:right w:val="single" w:color="C9D1D9" w:sz="4"/>
+            </w:tcBorders>
+            <w:shd w:fill="E7EDF3" w:color="auto" w:val="clear"/>
+            <w:tcMar>
+              <w:top w:type="dxa" w:w="60"/>
+              <w:left w:type="dxa" w:w="100"/>
+              <w:bottom w:type="dxa" w:w="60"/>
+              <w:right w:type="dxa" w:w="100"/>
+            </w:tcMar>
+          </w:tcPr>
+          <w:p>
+            <w:pPr>
+              <w:spacing w:after="20" w:line="250"/>
+            </w:pPr>
+            <w:r>
+              <w:rPr>
+                <w:b/>
+                <w:bCs/>
+                <w:color w:val="1F3864"/>
+                <w:sz w:val="18"/>
+                <w:szCs w:val="18"/>
+              </w:rPr>
+              <w:t xml:space="preserve">So sánh</w:t>
+            </w:r>
+          </w:p>
+        </w:tc>
+      </w:tr>
+      <w:tr>
+        <w:tc>
+          <w:tcPr>
+            <w:tcW w:type="dxa" w:w="2621"/>
+            <w:tcBorders>
+              <w:top w:val="single" w:color="C9D1D9" w:sz="4"/>
+              <w:left w:val="single" w:color="C9D1D9" w:sz="4"/>
+              <w:bottom w:val="single" w:color="C9D1D9" w:sz="4"/>
+              <w:right w:val="single" w:color="C9D1D9" w:sz="4"/>
+            </w:tcBorders>
+            <w:shd w:fill="FFFFFF" w:color="auto" w:val="clear"/>
+            <w:tcMar>
+              <w:top w:type="dxa" w:w="60"/>
+              <w:left w:type="dxa" w:w="100"/>
+              <w:bottom w:type="dxa" w:w="60"/>
+              <w:right w:type="dxa" w:w="100"/>
+            </w:tcMar>
+          </w:tcPr>
+          <w:p>
+            <w:pPr>
+              <w:spacing w:after="20" w:line="250"/>
+            </w:pPr>
+            <w:r>
+              <w:rPr>
+                <w:sz w:val="18"/>
+                <w:szCs w:val="18"/>
+              </w:rPr>
+              <w:t xml:space="preserve">Q3/2025 (tháng 7–9)</w:t>
+            </w:r>
+          </w:p>
+        </w:tc>
+        <w:tc>
+          <w:tcPr>
+            <w:tcW w:type="dxa" w:w="2419"/>
+            <w:tcBorders>
+              <w:top w:val="single" w:color="C9D1D9" w:sz="4"/>
+              <w:left w:val="single" w:color="C9D1D9" w:sz="4"/>
+              <w:bottom w:val="single" w:color="C9D1D9" w:sz="4"/>
+              <w:right w:val="single" w:color="C9D1D9" w:sz="4"/>
+            </w:tcBorders>
+            <w:shd w:fill="FFFFFF" w:color="auto" w:val="clear"/>
+            <w:tcMar>
+              <w:top w:type="dxa" w:w="60"/>
+              <w:left w:type="dxa" w:w="100"/>
+              <w:bottom w:type="dxa" w:w="60"/>
+              <w:right w:type="dxa" w:w="100"/>
+            </w:tcMar>
+          </w:tcPr>
+          <w:p>
+            <w:pPr>
+              <w:spacing w:after="20" w:line="250"/>
+            </w:pPr>
+            <w:r>
+              <w:rPr>
+                <w:sz w:val="18"/>
+                <w:szCs w:val="18"/>
+              </w:rPr>
+              <w:t xml:space="preserve">khoảng 570 nghìn</w:t>
+            </w:r>
+          </w:p>
+        </w:tc>
+        <w:tc>
+          <w:tcPr>
+            <w:tcW w:type="dxa" w:w="5040"/>
+            <w:tcBorders>
+              <w:top w:val="single" w:color="C9D1D9" w:sz="4"/>
+              <w:left w:val="single" w:color="C9D1D9" w:sz="4"/>
+              <w:bottom w:val="single" w:color="C9D1D9" w:sz="4"/>
+              <w:right w:val="single" w:color="C9D1D9" w:sz="4"/>
+            </w:tcBorders>
+            <w:shd w:fill="FFFFFF" w:color="auto" w:val="clear"/>
+            <w:tcMar>
+              <w:top w:type="dxa" w:w="60"/>
+              <w:left w:type="dxa" w:w="100"/>
+              <w:bottom w:type="dxa" w:w="60"/>
+              <w:right w:type="dxa" w:w="100"/>
+            </w:tcMar>
+          </w:tcPr>
+          <w:p>
+            <w:pPr>
+              <w:spacing w:after="20" w:line="250"/>
+            </w:pPr>
+            <w:r>
+              <w:rPr>
+                <w:sz w:val="18"/>
+                <w:szCs w:val="18"/>
+              </w:rPr>
+              <w:t xml:space="preserve">Mốc so sánh</w:t>
+            </w:r>
+          </w:p>
+        </w:tc>
+      </w:tr>
+      <w:tr>
+        <w:tc>
+          <w:tcPr>
+            <w:tcW w:type="dxa" w:w="2621"/>
+            <w:tcBorders>
+              <w:top w:val="single" w:color="C9D1D9" w:sz="4"/>
+              <w:left w:val="single" w:color="C9D1D9" w:sz="4"/>
+              <w:bottom w:val="single" w:color="C9D1D9" w:sz="4"/>
+              <w:right w:val="single" w:color="C9D1D9" w:sz="4"/>
+            </w:tcBorders>
+            <w:shd w:fill="F6F7F8" w:color="auto" w:val="clear"/>
+            <w:tcMar>
+              <w:top w:type="dxa" w:w="60"/>
+              <w:left w:type="dxa" w:w="100"/>
+              <w:bottom w:type="dxa" w:w="60"/>
+              <w:right w:type="dxa" w:w="100"/>
+            </w:tcMar>
+          </w:tcPr>
+          <w:p>
+            <w:pPr>
+              <w:spacing w:after="20" w:line="250"/>
+            </w:pPr>
+            <w:r>
+              <w:rPr>
+                <w:b/>
+                <w:bCs/>
+                <w:sz w:val="18"/>
+                <w:szCs w:val="18"/>
+              </w:rPr>
+              <w:t xml:space="preserve">Q4/2025 (tháng 10–12)</w:t>
+            </w:r>
+          </w:p>
+        </w:tc>
+        <w:tc>
+          <w:tcPr>
+            <w:tcW w:type="dxa" w:w="2419"/>
+            <w:tcBorders>
+              <w:top w:val="single" w:color="C9D1D9" w:sz="4"/>
+              <w:left w:val="single" w:color="C9D1D9" w:sz="4"/>
+              <w:bottom w:val="single" w:color="C9D1D9" w:sz="4"/>
+              <w:right w:val="single" w:color="C9D1D9" w:sz="4"/>
+            </w:tcBorders>
+            <w:shd w:fill="F6F7F8" w:color="auto" w:val="clear"/>
+            <w:tcMar>
+              <w:top w:type="dxa" w:w="60"/>
+              <w:left w:type="dxa" w:w="100"/>
+              <w:bottom w:type="dxa" w:w="60"/>
+              <w:right w:type="dxa" w:w="100"/>
+            </w:tcMar>
+          </w:tcPr>
+          <w:p>
+            <w:pPr>
+              <w:spacing w:after="20" w:line="250"/>
+            </w:pPr>
+            <w:r>
+              <w:rPr>
+                <w:b/>
+                <w:bCs/>
+                <w:sz w:val="18"/>
+                <w:szCs w:val="18"/>
+              </w:rPr>
+              <w:t xml:space="preserve">khoảng 1,09 triệu</w:t>
+            </w:r>
+          </w:p>
+        </w:tc>
+        <w:tc>
+          <w:tcPr>
+            <w:tcW w:type="dxa" w:w="5040"/>
+            <w:tcBorders>
+              <w:top w:val="single" w:color="C9D1D9" w:sz="4"/>
+              <w:left w:val="single" w:color="C9D1D9" w:sz="4"/>
+              <w:bottom w:val="single" w:color="C9D1D9" w:sz="4"/>
+              <w:right w:val="single" w:color="C9D1D9" w:sz="4"/>
+            </w:tcBorders>
+            <w:shd w:fill="F6F7F8" w:color="auto" w:val="clear"/>
+            <w:tcMar>
+              <w:top w:type="dxa" w:w="60"/>
+              <w:left w:type="dxa" w:w="100"/>
+              <w:bottom w:type="dxa" w:w="60"/>
+              <w:right w:type="dxa" w:w="100"/>
+            </w:tcMar>
+          </w:tcPr>
+          <w:p>
+            <w:pPr>
+              <w:spacing w:after="20" w:line="250"/>
+            </w:pPr>
+            <w:r>
+              <w:rPr>
+                <w:b/>
+                <w:bCs/>
+                <w:sz w:val="18"/>
+                <w:szCs w:val="18"/>
+              </w:rPr>
+              <w:t xml:space="preserve">Gấp khoảng 1,9 lần Q3.</w:t>
+            </w:r>
+            <w:r>
+              <w:rPr>
+                <w:sz w:val="18"/>
+                <w:szCs w:val="18"/>
+              </w:rPr>
+              <w:t xml:space="preserve"> Tháng 12 là đỉnh (khoảng 415 nghìn); riêng tháng 10 đã tăng khoảng 67% so với tháng 9</w:t>
+            </w:r>
+          </w:p>
+        </w:tc>
+      </w:tr>
+      <w:tr>
+        <w:tc>
+          <w:tcPr>
+            <w:tcW w:type="dxa" w:w="2621"/>
+            <w:tcBorders>
+              <w:top w:val="single" w:color="C9D1D9" w:sz="4"/>
+              <w:left w:val="single" w:color="C9D1D9" w:sz="4"/>
+              <w:bottom w:val="single" w:color="C9D1D9" w:sz="4"/>
+              <w:right w:val="single" w:color="C9D1D9" w:sz="4"/>
+            </w:tcBorders>
+            <w:shd w:fill="FFFFFF" w:color="auto" w:val="clear"/>
+            <w:tcMar>
+              <w:top w:type="dxa" w:w="60"/>
+              <w:left w:type="dxa" w:w="100"/>
+              <w:bottom w:type="dxa" w:w="60"/>
+              <w:right w:type="dxa" w:w="100"/>
+            </w:tcMar>
+          </w:tcPr>
+          <w:p>
+            <w:pPr>
+              <w:spacing w:after="20" w:line="250"/>
+            </w:pPr>
+            <w:r>
+              <w:rPr>
+                <w:b/>
+                <w:bCs/>
+                <w:sz w:val="18"/>
+                <w:szCs w:val="18"/>
+              </w:rPr>
+              <w:t xml:space="preserve">Q1/2026 (tháng 1–3)</w:t>
+            </w:r>
+          </w:p>
+        </w:tc>
+        <w:tc>
+          <w:tcPr>
+            <w:tcW w:type="dxa" w:w="2419"/>
+            <w:tcBorders>
+              <w:top w:val="single" w:color="C9D1D9" w:sz="4"/>
+              <w:left w:val="single" w:color="C9D1D9" w:sz="4"/>
+              <w:bottom w:val="single" w:color="C9D1D9" w:sz="4"/>
+              <w:right w:val="single" w:color="C9D1D9" w:sz="4"/>
+            </w:tcBorders>
+            <w:shd w:fill="FFFFFF" w:color="auto" w:val="clear"/>
+            <w:tcMar>
+              <w:top w:type="dxa" w:w="60"/>
+              <w:left w:type="dxa" w:w="100"/>
+              <w:bottom w:type="dxa" w:w="60"/>
+              <w:right w:type="dxa" w:w="100"/>
+            </w:tcMar>
+          </w:tcPr>
+          <w:p>
+            <w:pPr>
+              <w:spacing w:after="20" w:line="250"/>
+            </w:pPr>
+            <w:r>
+              <w:rPr>
+                <w:b/>
+                <w:bCs/>
+                <w:sz w:val="18"/>
+                <w:szCs w:val="18"/>
+              </w:rPr>
+              <w:t xml:space="preserve">khoảng 768 nghìn</w:t>
+            </w:r>
+          </w:p>
+        </w:tc>
+        <w:tc>
+          <w:tcPr>
+            <w:tcW w:type="dxa" w:w="5040"/>
+            <w:tcBorders>
+              <w:top w:val="single" w:color="C9D1D9" w:sz="4"/>
+              <w:left w:val="single" w:color="C9D1D9" w:sz="4"/>
+              <w:bottom w:val="single" w:color="C9D1D9" w:sz="4"/>
+              <w:right w:val="single" w:color="C9D1D9" w:sz="4"/>
+            </w:tcBorders>
+            <w:shd w:fill="FFFFFF" w:color="auto" w:val="clear"/>
+            <w:tcMar>
+              <w:top w:type="dxa" w:w="60"/>
+              <w:left w:type="dxa" w:w="100"/>
+              <w:bottom w:type="dxa" w:w="60"/>
+              <w:right w:type="dxa" w:w="100"/>
+            </w:tcMar>
+          </w:tcPr>
+          <w:p>
+            <w:pPr>
+              <w:spacing w:after="20" w:line="250"/>
+            </w:pPr>
+            <w:r>
+              <w:rPr>
+                <w:b/>
+                <w:bCs/>
+                <w:sz w:val="18"/>
+                <w:szCs w:val="18"/>
+              </w:rPr>
+              <w:t xml:space="preserve">Còn khoảng 70% Q4.</w:t>
+            </w:r>
+            <w:r>
+              <w:rPr>
+                <w:sz w:val="18"/>
+                <w:szCs w:val="18"/>
+              </w:rPr>
+              <w:t xml:space="preserve"> Tháng 1 giảm khoảng 39% so với tháng 12, tháng 2 là đáy, tháng 3 hồi lại</w:t>
+            </w:r>
+          </w:p>
+        </w:tc>
+      </w:tr>
+      <w:tr>
+        <w:tc>
+          <w:tcPr>
+            <w:tcW w:type="dxa" w:w="2621"/>
+            <w:tcBorders>
+              <w:top w:val="single" w:color="C9D1D9" w:sz="4"/>
+              <w:left w:val="single" w:color="C9D1D9" w:sz="4"/>
+              <w:bottom w:val="single" w:color="C9D1D9" w:sz="4"/>
+              <w:right w:val="single" w:color="C9D1D9" w:sz="4"/>
+            </w:tcBorders>
+            <w:shd w:fill="F6F7F8" w:color="auto" w:val="clear"/>
+            <w:tcMar>
+              <w:top w:type="dxa" w:w="60"/>
+              <w:left w:type="dxa" w:w="100"/>
+              <w:bottom w:type="dxa" w:w="60"/>
+              <w:right w:type="dxa" w:w="100"/>
+            </w:tcMar>
+          </w:tcPr>
+          <w:p>
+            <w:pPr>
+              <w:spacing w:after="20" w:line="250"/>
+            </w:pPr>
+            <w:r>
+              <w:rPr>
+                <w:sz w:val="18"/>
+                <w:szCs w:val="18"/>
+              </w:rPr>
+              <w:t xml:space="preserve">Mùa lễ 2024 (tháng 11–12/2024)</w:t>
+            </w:r>
+          </w:p>
+        </w:tc>
+        <w:tc>
+          <w:tcPr>
+            <w:tcW w:type="dxa" w:w="2419"/>
+            <w:tcBorders>
+              <w:top w:val="single" w:color="C9D1D9" w:sz="4"/>
+              <w:left w:val="single" w:color="C9D1D9" w:sz="4"/>
+              <w:bottom w:val="single" w:color="C9D1D9" w:sz="4"/>
+              <w:right w:val="single" w:color="C9D1D9" w:sz="4"/>
+            </w:tcBorders>
+            <w:shd w:fill="F6F7F8" w:color="auto" w:val="clear"/>
+            <w:tcMar>
+              <w:top w:type="dxa" w:w="60"/>
+              <w:left w:type="dxa" w:w="100"/>
+              <w:bottom w:type="dxa" w:w="60"/>
+              <w:right w:type="dxa" w:w="100"/>
+            </w:tcMar>
+          </w:tcPr>
+          <w:p>
+            <w:pPr>
+              <w:spacing w:after="20" w:line="250"/>
+            </w:pPr>
+            <w:r>
+              <w:rPr>
+                <w:sz w:val="18"/>
+                <w:szCs w:val="18"/>
+              </w:rPr>
+              <w:t xml:space="preserve">khoảng 270 nghìn/tháng</w:t>
+            </w:r>
+          </w:p>
+        </w:tc>
+        <w:tc>
+          <w:tcPr>
+            <w:tcW w:type="dxa" w:w="5040"/>
+            <w:tcBorders>
+              <w:top w:val="single" w:color="C9D1D9" w:sz="4"/>
+              <w:left w:val="single" w:color="C9D1D9" w:sz="4"/>
+              <w:bottom w:val="single" w:color="C9D1D9" w:sz="4"/>
+              <w:right w:val="single" w:color="C9D1D9" w:sz="4"/>
+            </w:tcBorders>
+            <w:shd w:fill="F6F7F8" w:color="auto" w:val="clear"/>
+            <w:tcMar>
+              <w:top w:type="dxa" w:w="60"/>
+              <w:left w:type="dxa" w:w="100"/>
+              <w:bottom w:type="dxa" w:w="60"/>
+              <w:right w:type="dxa" w:w="100"/>
+            </w:tcMar>
+          </w:tcPr>
+          <w:p>
+            <w:pPr>
+              <w:spacing w:after="20" w:line="250"/>
+            </w:pPr>
+            <w:r>
+              <w:rPr>
+                <w:sz w:val="18"/>
+                <w:szCs w:val="18"/>
+              </w:rPr>
+              <w:t xml:space="preserve">Cùng hình dạng: đỉnh tháng 11–12, giảm mạnh tháng 1/2025</w:t>
+            </w:r>
+          </w:p>
+        </w:tc>
+      </w:tr>
+    </w:tbl>
+    <w:p>
+      <w:pPr>
+        <w:pBdr>
+          <w:left w:val="single" w:color="2A78D6" w:sz="18" w:space="8"/>
+        </w:pBdr>
+        <w:spacing w:after="180" w:before="60" w:line="276"/>
+        <w:ind w:left="160"/>
+      </w:pPr>
+      <w:r>
+        <w:rPr>
+          <w:b/>
+          <w:bCs/>
+          <w:color w:val="2A78D6"/>
+        </w:rPr>
+        <w:t xml:space="preserve">So what: </w:t>
+      </w:r>
+      <w:r>
+        <w:t xml:space="preserve">Đây là </w:t>
+      </w:r>
+      <w:r>
+        <w:rPr>
+          <w:b/>
+          <w:bCs/>
+        </w:rPr>
+        <w:t xml:space="preserve">bằng chứng doanh số ước tính trên chính Amazon</w:t>
+      </w:r>
+      <w:r>
+        <w:t xml:space="preserve">, bổ sung cho số chi tiêu của Adobe: nhóm dẫn đầu thời trang nữ bán gần gấp đôi trong Q4, và Q1 vẫn giữ khoảng 70% mức Q4, nên </w:t>
+      </w:r>
+      <w:r>
+        <w:rPr>
+          <w:b/>
+          <w:bCs/>
+        </w:rPr>
+        <w:t xml:space="preserve">Q1 không phải mùa chết</w:t>
+      </w:r>
+      <w:r>
+        <w:t xml:space="preserve">. Chiến dịch 6 tháng có hai nhịp. Nhịp 1 (tháng 10–12) là cao điểm, cần listing mới sẵn sàng </w:t>
+      </w:r>
+      <w:r>
+        <w:rPr>
+          <w:b/>
+          <w:bCs/>
+        </w:rPr>
+        <w:t xml:space="preserve">từ đầu tháng 10</w:t>
+      </w:r>
+      <w:r>
+        <w:t xml:space="preserve">, vì tháng 10 đã tăng vọt. Nhịp 2 (tháng 1–3): tháng 1–2 chững lại sau lễ, tháng 3 hồi lại cùng spring break và Phục sinh. Valentine chỉ là cửa sổ ngách cho SP3 hồng. Lưu ý: đây là doanh số quá khứ của các sản phẩm </w:t>
+      </w:r>
+      <w:r>
+        <w:rPr>
+          <w:b/>
+          <w:bCs/>
+        </w:rPr>
+        <w:t xml:space="preserve">đang</w:t>
+      </w:r>
+      <w:r>
+        <w:t xml:space="preserve"> ở top, nên các tháng cũ bị đánh giá thấp. Vì vậy chỉ so các quý liền kề, không đọc thành tốc độ tăng trưởng năm.</w:t>
+      </w:r>
+    </w:p>
+    <w:p>
+      <w:pPr>
+        <w:pStyle w:val="Heading3"/>
+      </w:pPr>
+      <w:r>
+        <w:t xml:space="preserve">1.1.3 Nhu cầu tìm kiếm theo mùa: “mùa hè” mất sức hút, “dịp” và “đặc tính” lên ngôi</w:t>
+      </w:r>
+    </w:p>
+    <w:p>
+      <w:pPr>
+        <w:spacing w:after="60"/>
+        <w:jc w:val="center"/>
+      </w:pPr>
+      <w:r>
+        <w:drawing>
+          <wp:inline distT="0" distB="0" distL="0" distR="0">
+            <wp:extent cx="5905500" cy="2457450"/>
+            <wp:effectExtent t="0" r="0" b="0" l="0"/>
+            <wp:docPr id="2" name="" descr="" title=""/>
+            <wp:cNvGraphicFramePr>
+              <a:graphicFrameLocks xmlns:a="http://schemas.openxmlformats.org/drawingml/2006/main" noChangeAspect="1"/>
+            </wp:cNvGraphicFramePr>
+            <a:graphic xmlns:a="http://schemas.openxmlformats.org/drawingml/2006/main">
+              <a:graphicData uri="http://schemas.openxmlformats.org/drawingml/2006/picture">
+                <pic:pic xmlns:pic="http://schemas.openxmlformats.org/drawingml/2006/picture">
+                  <pic:nvPicPr>
+                    <pic:cNvPr id="0" name="" descr=""/>
+                    <pic:cNvPicPr>
+                      <a:picLocks noChangeAspect="1" noChangeArrowheads="1"/>
+                    </pic:cNvPicPr>
+                  </pic:nvPicPr>
+                  <pic:blipFill>
+                    <a:blip r:embed="rId9" cstate="none"/>
                     <a:srcRect/>
                     <a:stretch>
                       <a:fillRect/>
@@ -1575,7 +2245,7 @@
           <w:sz w:val="17"/>
           <w:szCs w:val="17"/>
         </w:rPr>
-        <w:t xml:space="preserve">Hình 1. Q4 index = mức quan tâm trung bình tháng 10–12 so với mức nền năm của chính truy vấn đó (nền = 100), tính trên chuỗi Google Trends US 09/2021–09/2026. Chỉ so mỗi truy vấn với chính nó, không so độ lớn giữa các truy vấn. Nguồn: Dữ liệu nhóm.</w:t>
+        <w:t xml:space="preserve">Hình 2. Q4 index = mức quan tâm trung bình tháng 10–12 so với mức nền năm của chính truy vấn đó (nền = 100), tính trên chuỗi Google Trends US 09/2021–09/2026. Chỉ so mỗi truy vấn với chính nó, không so độ lớn giữa các truy vấn. Nguồn: Dữ liệu nhóm.</w:t>
       </w:r>
     </w:p>
     <w:tbl>
@@ -2575,7 +3245,7 @@
         <w:pStyle w:val="Heading3"/>
       </w:pPr>
       <w:r>
-        <w:t xml:space="preserve">1.1.3 Nhu cầu trên Amazon: bốn loại ý định tìm kiếm</w:t>
+        <w:t xml:space="preserve">1.1.4 Nhu cầu trên Amazon: bốn loại ý định tìm kiếm</w:t>
       </w:r>
     </w:p>
     <w:p>
@@ -2588,7 +3258,7 @@
           <wp:inline distT="0" distB="0" distL="0" distR="0">
             <wp:extent cx="5905500" cy="3200400"/>
             <wp:effectExtent t="0" r="0" b="0" l="0"/>
-            <wp:docPr id="2" name="" descr="" title=""/>
+            <wp:docPr id="3" name="" descr="" title=""/>
             <wp:cNvGraphicFramePr>
               <a:graphicFrameLocks xmlns:a="http://schemas.openxmlformats.org/drawingml/2006/main" noChangeAspect="1"/>
             </wp:cNvGraphicFramePr>
@@ -2602,7 +3272,7 @@
                     </pic:cNvPicPr>
                   </pic:nvPicPr>
                   <pic:blipFill>
-                    <a:blip r:embed="rId9" cstate="none"/>
+                    <a:blip r:embed="rId10" cstate="none"/>
                     <a:srcRect/>
                     <a:stretch>
                       <a:fillRect/>
@@ -2636,7 +3306,7 @@
           <w:sz w:val="17"/>
           <w:szCs w:val="17"/>
         </w:rPr>
-        <w:t xml:space="preserve">Hình 2. Search volume là ước tính 30 ngày gần nhất của Helium 10 (Amazon US), ghi ngày 29/09/2026, nên phản ánh nhu cầu tháng 9, chưa phải đỉnh mùa lễ. Không cộng volume các truy vấn chồng lấn. Nguồn: Dữ liệu nhóm.</w:t>
+        <w:t xml:space="preserve">Hình 3. Search volume là ước tính 30 ngày gần nhất của Helium 10 (Amazon US), ghi ngày 29/09/2026, nên phản ánh nhu cầu tháng 9, chưa phải đỉnh mùa lễ. Không cộng volume các truy vấn chồng lấn. Nguồn: Dữ liệu nhóm.</w:t>
       </w:r>
     </w:p>
     <w:tbl>
@@ -3384,7 +4054,7 @@
         <w:pStyle w:val="Heading3"/>
       </w:pPr>
       <w:r>
-        <w:t xml:space="preserve">1.1.4 Lịch mua sắm Q4/2026 – Q1/2027</w:t>
+        <w:t xml:space="preserve">1.1.5 Lịch mua sắm Q4/2026 – Q1/2027</w:t>
       </w:r>
     </w:p>
     <w:tbl>
@@ -7397,7 +8067,7 @@
                 <w:sz w:val="18"/>
                 <w:szCs w:val="18"/>
               </w:rPr>
-              <w:t xml:space="preserve">SP2 đắt hơn đối thủ trực tiếp khoảng 70%; SP3 ngang giá; SP1 nằm giữa benchmark</w:t>
+              <w:t xml:space="preserve">SP2 đắt hơn đối thủ trực tiếp khoảng 70%; SP1, SP2 ở vùng 50–60 USD (khoảng 5% doanh số Best Seller); SP3 ở vùng 20–30 USD, ngang giá đối thủ</w:t>
             </w:r>
           </w:p>
         </w:tc>
@@ -8393,6 +9063,1079 @@
         </w:tc>
       </w:tr>
     </w:tbl>
+    <w:p>
+      <w:pPr>
+        <w:spacing w:after="60" w:before="120"/>
+      </w:pPr>
+      <w:r>
+        <w:rPr>
+          <w:b/>
+          <w:bCs/>
+          <w:color w:val="1F3864"/>
+          <w:sz w:val="18"/>
+          <w:szCs w:val="18"/>
+        </w:rPr>
+        <w:t xml:space="preserve">Chuẩn của nhóm Best Seller và vị trí của SIXDO (top 100 Best Seller Amazon US, SellerSprite 09/2026; báo cáo không ghi danh mục)</w:t>
+      </w:r>
+    </w:p>
+    <w:tbl>
+      <w:tblPr>
+        <w:tblW w:type="dxa" w:w="10080"/>
+        <w:tblBorders>
+          <w:top w:val="single" w:color="auto" w:sz="4"/>
+          <w:left w:val="single" w:color="auto" w:sz="4"/>
+          <w:bottom w:val="single" w:color="auto" w:sz="4"/>
+          <w:right w:val="single" w:color="auto" w:sz="4"/>
+          <w:insideH w:val="single" w:color="auto" w:sz="4"/>
+          <w:insideV w:val="single" w:color="auto" w:sz="4"/>
+        </w:tblBorders>
+      </w:tblPr>
+      <w:tblGrid>
+        <w:gridCol w:w="1613"/>
+        <w:gridCol w:w="3427"/>
+        <w:gridCol w:w="2218"/>
+        <w:gridCol w:w="2822"/>
+      </w:tblGrid>
+      <w:tr>
+        <w:trPr>
+          <w:tblHeader/>
+        </w:trPr>
+        <w:tc>
+          <w:tcPr>
+            <w:tcW w:type="dxa" w:w="1613"/>
+            <w:tcBorders>
+              <w:top w:val="single" w:color="C9D1D9" w:sz="4"/>
+              <w:left w:val="single" w:color="C9D1D9" w:sz="4"/>
+              <w:bottom w:val="single" w:color="C9D1D9" w:sz="4"/>
+              <w:right w:val="single" w:color="C9D1D9" w:sz="4"/>
+            </w:tcBorders>
+            <w:shd w:fill="E7EDF3" w:color="auto" w:val="clear"/>
+            <w:tcMar>
+              <w:top w:type="dxa" w:w="60"/>
+              <w:left w:type="dxa" w:w="100"/>
+              <w:bottom w:type="dxa" w:w="60"/>
+              <w:right w:type="dxa" w:w="100"/>
+            </w:tcMar>
+          </w:tcPr>
+          <w:p>
+            <w:pPr>
+              <w:spacing w:after="20" w:line="250"/>
+            </w:pPr>
+            <w:r>
+              <w:rPr>
+                <w:b/>
+                <w:bCs/>
+                <w:color w:val="1F3864"/>
+                <w:sz w:val="18"/>
+                <w:szCs w:val="18"/>
+              </w:rPr>
+              <w:t xml:space="preserve">Chỉ số</w:t>
+            </w:r>
+          </w:p>
+        </w:tc>
+        <w:tc>
+          <w:tcPr>
+            <w:tcW w:type="dxa" w:w="3427"/>
+            <w:tcBorders>
+              <w:top w:val="single" w:color="C9D1D9" w:sz="4"/>
+              <w:left w:val="single" w:color="C9D1D9" w:sz="4"/>
+              <w:bottom w:val="single" w:color="C9D1D9" w:sz="4"/>
+              <w:right w:val="single" w:color="C9D1D9" w:sz="4"/>
+            </w:tcBorders>
+            <w:shd w:fill="E7EDF3" w:color="auto" w:val="clear"/>
+            <w:tcMar>
+              <w:top w:type="dxa" w:w="60"/>
+              <w:left w:type="dxa" w:w="100"/>
+              <w:bottom w:type="dxa" w:w="60"/>
+              <w:right w:type="dxa" w:w="100"/>
+            </w:tcMar>
+          </w:tcPr>
+          <w:p>
+            <w:pPr>
+              <w:spacing w:after="20" w:line="250"/>
+            </w:pPr>
+            <w:r>
+              <w:rPr>
+                <w:b/>
+                <w:bCs/>
+                <w:color w:val="1F3864"/>
+                <w:sz w:val="18"/>
+                <w:szCs w:val="18"/>
+              </w:rPr>
+              <w:t xml:space="preserve">Top 100 Best Seller</w:t>
+            </w:r>
+          </w:p>
+        </w:tc>
+        <w:tc>
+          <w:tcPr>
+            <w:tcW w:type="dxa" w:w="2218"/>
+            <w:tcBorders>
+              <w:top w:val="single" w:color="C9D1D9" w:sz="4"/>
+              <w:left w:val="single" w:color="C9D1D9" w:sz="4"/>
+              <w:bottom w:val="single" w:color="C9D1D9" w:sz="4"/>
+              <w:right w:val="single" w:color="C9D1D9" w:sz="4"/>
+            </w:tcBorders>
+            <w:shd w:fill="E7EDF3" w:color="auto" w:val="clear"/>
+            <w:tcMar>
+              <w:top w:type="dxa" w:w="60"/>
+              <w:left w:type="dxa" w:w="100"/>
+              <w:bottom w:type="dxa" w:w="60"/>
+              <w:right w:type="dxa" w:w="100"/>
+            </w:tcMar>
+          </w:tcPr>
+          <w:p>
+            <w:pPr>
+              <w:spacing w:after="20" w:line="250"/>
+            </w:pPr>
+            <w:r>
+              <w:rPr>
+                <w:b/>
+                <w:bCs/>
+                <w:color w:val="1F3864"/>
+                <w:sz w:val="18"/>
+                <w:szCs w:val="18"/>
+              </w:rPr>
+              <w:t xml:space="preserve">SIXDO hiện tại</w:t>
+            </w:r>
+          </w:p>
+        </w:tc>
+        <w:tc>
+          <w:tcPr>
+            <w:tcW w:type="dxa" w:w="2822"/>
+            <w:tcBorders>
+              <w:top w:val="single" w:color="C9D1D9" w:sz="4"/>
+              <w:left w:val="single" w:color="C9D1D9" w:sz="4"/>
+              <w:bottom w:val="single" w:color="C9D1D9" w:sz="4"/>
+              <w:right w:val="single" w:color="C9D1D9" w:sz="4"/>
+            </w:tcBorders>
+            <w:shd w:fill="E7EDF3" w:color="auto" w:val="clear"/>
+            <w:tcMar>
+              <w:top w:type="dxa" w:w="60"/>
+              <w:left w:type="dxa" w:w="100"/>
+              <w:bottom w:type="dxa" w:w="60"/>
+              <w:right w:type="dxa" w:w="100"/>
+            </w:tcMar>
+          </w:tcPr>
+          <w:p>
+            <w:pPr>
+              <w:spacing w:after="20" w:line="250"/>
+            </w:pPr>
+            <w:r>
+              <w:rPr>
+                <w:b/>
+                <w:bCs/>
+                <w:color w:val="1F3864"/>
+                <w:sz w:val="18"/>
+                <w:szCs w:val="18"/>
+              </w:rPr>
+              <w:t xml:space="preserve">Hàm ý</w:t>
+            </w:r>
+          </w:p>
+        </w:tc>
+      </w:tr>
+      <w:tr>
+        <w:tc>
+          <w:tcPr>
+            <w:tcW w:type="dxa" w:w="1613"/>
+            <w:tcBorders>
+              <w:top w:val="single" w:color="C9D1D9" w:sz="4"/>
+              <w:left w:val="single" w:color="C9D1D9" w:sz="4"/>
+              <w:bottom w:val="single" w:color="C9D1D9" w:sz="4"/>
+              <w:right w:val="single" w:color="C9D1D9" w:sz="4"/>
+            </w:tcBorders>
+            <w:shd w:fill="FFFFFF" w:color="auto" w:val="clear"/>
+            <w:tcMar>
+              <w:top w:type="dxa" w:w="60"/>
+              <w:left w:type="dxa" w:w="100"/>
+              <w:bottom w:type="dxa" w:w="60"/>
+              <w:right w:type="dxa" w:w="100"/>
+            </w:tcMar>
+          </w:tcPr>
+          <w:p>
+            <w:pPr>
+              <w:spacing w:after="20" w:line="250"/>
+            </w:pPr>
+            <w:r>
+              <w:rPr>
+                <w:sz w:val="18"/>
+                <w:szCs w:val="18"/>
+              </w:rPr>
+              <w:t xml:space="preserve">Giá</w:t>
+            </w:r>
+          </w:p>
+        </w:tc>
+        <w:tc>
+          <w:tcPr>
+            <w:tcW w:type="dxa" w:w="3427"/>
+            <w:tcBorders>
+              <w:top w:val="single" w:color="C9D1D9" w:sz="4"/>
+              <w:left w:val="single" w:color="C9D1D9" w:sz="4"/>
+              <w:bottom w:val="single" w:color="C9D1D9" w:sz="4"/>
+              <w:right w:val="single" w:color="C9D1D9" w:sz="4"/>
+            </w:tcBorders>
+            <w:shd w:fill="FFFFFF" w:color="auto" w:val="clear"/>
+            <w:tcMar>
+              <w:top w:type="dxa" w:w="60"/>
+              <w:left w:type="dxa" w:w="100"/>
+              <w:bottom w:type="dxa" w:w="60"/>
+              <w:right w:type="dxa" w:w="100"/>
+            </w:tcMar>
+          </w:tcPr>
+          <w:p>
+            <w:pPr>
+              <w:spacing w:after="20" w:line="250"/>
+            </w:pPr>
+            <w:r>
+              <w:rPr>
+                <w:sz w:val="18"/>
+                <w:szCs w:val="18"/>
+              </w:rPr>
+              <w:t xml:space="preserve">Trung bình 40,05 USD. Doanh số bình quân mỗi sản phẩm (so với mức chung): vùng 50–60 USD yếu nhất (khoảng 0,45 lần), vùng 20–30 USD dưới mức chung (khoảng 0,6 lần), còn vùng trên 70 USD cao nhất (khoảng 1,8 lần)</w:t>
+            </w:r>
+          </w:p>
+        </w:tc>
+        <w:tc>
+          <w:tcPr>
+            <w:tcW w:type="dxa" w:w="2218"/>
+            <w:tcBorders>
+              <w:top w:val="single" w:color="C9D1D9" w:sz="4"/>
+              <w:left w:val="single" w:color="C9D1D9" w:sz="4"/>
+              <w:bottom w:val="single" w:color="C9D1D9" w:sz="4"/>
+              <w:right w:val="single" w:color="C9D1D9" w:sz="4"/>
+            </w:tcBorders>
+            <w:shd w:fill="FFFFFF" w:color="auto" w:val="clear"/>
+            <w:tcMar>
+              <w:top w:type="dxa" w:w="60"/>
+              <w:left w:type="dxa" w:w="100"/>
+              <w:bottom w:type="dxa" w:w="60"/>
+              <w:right w:type="dxa" w:w="100"/>
+            </w:tcMar>
+          </w:tcPr>
+          <w:p>
+            <w:pPr>
+              <w:spacing w:after="20" w:line="250"/>
+            </w:pPr>
+            <w:r>
+              <w:rPr>
+                <w:sz w:val="18"/>
+                <w:szCs w:val="18"/>
+              </w:rPr>
+              <w:t xml:space="preserve">SP1, SP2: 51,99 USD (vùng 50–60). SP3: 25,99 USD (vùng 20–30)</w:t>
+            </w:r>
+          </w:p>
+        </w:tc>
+        <w:tc>
+          <w:tcPr>
+            <w:tcW w:type="dxa" w:w="2822"/>
+            <w:tcBorders>
+              <w:top w:val="single" w:color="C9D1D9" w:sz="4"/>
+              <w:left w:val="single" w:color="C9D1D9" w:sz="4"/>
+              <w:bottom w:val="single" w:color="C9D1D9" w:sz="4"/>
+              <w:right w:val="single" w:color="C9D1D9" w:sz="4"/>
+            </w:tcBorders>
+            <w:shd w:fill="FFFFFF" w:color="auto" w:val="clear"/>
+            <w:tcMar>
+              <w:top w:type="dxa" w:w="60"/>
+              <w:left w:type="dxa" w:w="100"/>
+              <w:bottom w:type="dxa" w:w="60"/>
+              <w:right w:type="dxa" w:w="100"/>
+            </w:tcMar>
+          </w:tcPr>
+          <w:p>
+            <w:pPr>
+              <w:spacing w:after="20" w:line="250"/>
+            </w:pPr>
+            <w:r>
+              <w:rPr>
+                <w:sz w:val="18"/>
+                <w:szCs w:val="18"/>
+              </w:rPr>
+              <w:t xml:space="preserve">Giá không tự quyết định doanh số: vùng trên 70 USD vẫn bán tốt. SP1, SP2 </w:t>
+            </w:r>
+            <w:r>
+              <w:rPr>
+                <w:b/>
+                <w:bCs/>
+                <w:sz w:val="18"/>
+                <w:szCs w:val="18"/>
+              </w:rPr>
+              <w:t xml:space="preserve">không cần hạ giá</w:t>
+            </w:r>
+            <w:r>
+              <w:rPr>
+                <w:sz w:val="18"/>
+                <w:szCs w:val="18"/>
+              </w:rPr>
+              <w:t xml:space="preserve"> mà cần </w:t>
+            </w:r>
+            <w:r>
+              <w:rPr>
+                <w:b/>
+                <w:bCs/>
+                <w:sz w:val="18"/>
+                <w:szCs w:val="18"/>
+              </w:rPr>
+              <w:t xml:space="preserve">lý do đáng tiền</w:t>
+            </w:r>
+            <w:r>
+              <w:rPr>
+                <w:sz w:val="18"/>
+                <w:szCs w:val="18"/>
+              </w:rPr>
+              <w:t xml:space="preserve">. SP3 cũng không thắng nhờ giá rẻ, mà phải thắng bằng thiết kế</w:t>
+            </w:r>
+          </w:p>
+        </w:tc>
+      </w:tr>
+      <w:tr>
+        <w:tc>
+          <w:tcPr>
+            <w:tcW w:type="dxa" w:w="1613"/>
+            <w:tcBorders>
+              <w:top w:val="single" w:color="C9D1D9" w:sz="4"/>
+              <w:left w:val="single" w:color="C9D1D9" w:sz="4"/>
+              <w:bottom w:val="single" w:color="C9D1D9" w:sz="4"/>
+              <w:right w:val="single" w:color="C9D1D9" w:sz="4"/>
+            </w:tcBorders>
+            <w:shd w:fill="F6F7F8" w:color="auto" w:val="clear"/>
+            <w:tcMar>
+              <w:top w:type="dxa" w:w="60"/>
+              <w:left w:type="dxa" w:w="100"/>
+              <w:bottom w:type="dxa" w:w="60"/>
+              <w:right w:type="dxa" w:w="100"/>
+            </w:tcMar>
+          </w:tcPr>
+          <w:p>
+            <w:pPr>
+              <w:spacing w:after="20" w:line="250"/>
+            </w:pPr>
+            <w:r>
+              <w:rPr>
+                <w:sz w:val="18"/>
+                <w:szCs w:val="18"/>
+              </w:rPr>
+              <w:t xml:space="preserve">Số đánh giá</w:t>
+            </w:r>
+          </w:p>
+        </w:tc>
+        <w:tc>
+          <w:tcPr>
+            <w:tcW w:type="dxa" w:w="3427"/>
+            <w:tcBorders>
+              <w:top w:val="single" w:color="C9D1D9" w:sz="4"/>
+              <w:left w:val="single" w:color="C9D1D9" w:sz="4"/>
+              <w:bottom w:val="single" w:color="C9D1D9" w:sz="4"/>
+              <w:right w:val="single" w:color="C9D1D9" w:sz="4"/>
+            </w:tcBorders>
+            <w:shd w:fill="F6F7F8" w:color="auto" w:val="clear"/>
+            <w:tcMar>
+              <w:top w:type="dxa" w:w="60"/>
+              <w:left w:type="dxa" w:w="100"/>
+              <w:bottom w:type="dxa" w:w="60"/>
+              <w:right w:type="dxa" w:w="100"/>
+            </w:tcMar>
+          </w:tcPr>
+          <w:p>
+            <w:pPr>
+              <w:spacing w:after="20" w:line="250"/>
+            </w:pPr>
+            <w:r>
+              <w:rPr>
+                <w:sz w:val="18"/>
+                <w:szCs w:val="18"/>
+              </w:rPr>
+              <w:t xml:space="preserve">41/100 sản phẩm có trên 500 đánh giá và chiếm khoảng 75% doanh số. 13 sản phẩm có 1–50 đánh giá, chiếm khoảng 3%</w:t>
+            </w:r>
+          </w:p>
+        </w:tc>
+        <w:tc>
+          <w:tcPr>
+            <w:tcW w:type="dxa" w:w="2218"/>
+            <w:tcBorders>
+              <w:top w:val="single" w:color="C9D1D9" w:sz="4"/>
+              <w:left w:val="single" w:color="C9D1D9" w:sz="4"/>
+              <w:bottom w:val="single" w:color="C9D1D9" w:sz="4"/>
+              <w:right w:val="single" w:color="C9D1D9" w:sz="4"/>
+            </w:tcBorders>
+            <w:shd w:fill="F6F7F8" w:color="auto" w:val="clear"/>
+            <w:tcMar>
+              <w:top w:type="dxa" w:w="60"/>
+              <w:left w:type="dxa" w:w="100"/>
+              <w:bottom w:type="dxa" w:w="60"/>
+              <w:right w:type="dxa" w:w="100"/>
+            </w:tcMar>
+          </w:tcPr>
+          <w:p>
+            <w:pPr>
+              <w:spacing w:after="20" w:line="250"/>
+            </w:pPr>
+            <w:r>
+              <w:rPr>
+                <w:sz w:val="18"/>
+                <w:szCs w:val="18"/>
+              </w:rPr>
+              <w:t xml:space="preserve">2–8 đánh giá mỗi SKU</w:t>
+            </w:r>
+          </w:p>
+        </w:tc>
+        <w:tc>
+          <w:tcPr>
+            <w:tcW w:type="dxa" w:w="2822"/>
+            <w:tcBorders>
+              <w:top w:val="single" w:color="C9D1D9" w:sz="4"/>
+              <w:left w:val="single" w:color="C9D1D9" w:sz="4"/>
+              <w:bottom w:val="single" w:color="C9D1D9" w:sz="4"/>
+              <w:right w:val="single" w:color="C9D1D9" w:sz="4"/>
+            </w:tcBorders>
+            <w:shd w:fill="F6F7F8" w:color="auto" w:val="clear"/>
+            <w:tcMar>
+              <w:top w:type="dxa" w:w="60"/>
+              <w:left w:type="dxa" w:w="100"/>
+              <w:bottom w:type="dxa" w:w="60"/>
+              <w:right w:type="dxa" w:w="100"/>
+            </w:tcMar>
+          </w:tcPr>
+          <w:p>
+            <w:pPr>
+              <w:spacing w:after="20" w:line="250"/>
+            </w:pPr>
+            <w:r>
+              <w:rPr>
+                <w:sz w:val="18"/>
+                <w:szCs w:val="18"/>
+              </w:rPr>
+              <w:t xml:space="preserve">Review là rào cản lớn nhất. SIXDO phải thắng bằng nội dung listing và tích lũy review sớm</w:t>
+            </w:r>
+          </w:p>
+        </w:tc>
+      </w:tr>
+      <w:tr>
+        <w:tc>
+          <w:tcPr>
+            <w:tcW w:type="dxa" w:w="1613"/>
+            <w:tcBorders>
+              <w:top w:val="single" w:color="C9D1D9" w:sz="4"/>
+              <w:left w:val="single" w:color="C9D1D9" w:sz="4"/>
+              <w:bottom w:val="single" w:color="C9D1D9" w:sz="4"/>
+              <w:right w:val="single" w:color="C9D1D9" w:sz="4"/>
+            </w:tcBorders>
+            <w:shd w:fill="FFFFFF" w:color="auto" w:val="clear"/>
+            <w:tcMar>
+              <w:top w:type="dxa" w:w="60"/>
+              <w:left w:type="dxa" w:w="100"/>
+              <w:bottom w:type="dxa" w:w="60"/>
+              <w:right w:type="dxa" w:w="100"/>
+            </w:tcMar>
+          </w:tcPr>
+          <w:p>
+            <w:pPr>
+              <w:spacing w:after="20" w:line="250"/>
+            </w:pPr>
+            <w:r>
+              <w:rPr>
+                <w:sz w:val="18"/>
+                <w:szCs w:val="18"/>
+              </w:rPr>
+              <w:t xml:space="preserve">Điểm đánh giá</w:t>
+            </w:r>
+          </w:p>
+        </w:tc>
+        <w:tc>
+          <w:tcPr>
+            <w:tcW w:type="dxa" w:w="3427"/>
+            <w:tcBorders>
+              <w:top w:val="single" w:color="C9D1D9" w:sz="4"/>
+              <w:left w:val="single" w:color="C9D1D9" w:sz="4"/>
+              <w:bottom w:val="single" w:color="C9D1D9" w:sz="4"/>
+              <w:right w:val="single" w:color="C9D1D9" w:sz="4"/>
+            </w:tcBorders>
+            <w:shd w:fill="FFFFFF" w:color="auto" w:val="clear"/>
+            <w:tcMar>
+              <w:top w:type="dxa" w:w="60"/>
+              <w:left w:type="dxa" w:w="100"/>
+              <w:bottom w:type="dxa" w:w="60"/>
+              <w:right w:type="dxa" w:w="100"/>
+            </w:tcMar>
+          </w:tcPr>
+          <w:p>
+            <w:pPr>
+              <w:spacing w:after="20" w:line="250"/>
+            </w:pPr>
+            <w:r>
+              <w:rPr>
+                <w:sz w:val="18"/>
+                <w:szCs w:val="18"/>
+              </w:rPr>
+              <w:t xml:space="preserve">Trung bình 4,3. Không sản phẩm nào dưới 3,5; 96/100 từ 4,0 trở lên</w:t>
+            </w:r>
+          </w:p>
+        </w:tc>
+        <w:tc>
+          <w:tcPr>
+            <w:tcW w:type="dxa" w:w="2218"/>
+            <w:tcBorders>
+              <w:top w:val="single" w:color="C9D1D9" w:sz="4"/>
+              <w:left w:val="single" w:color="C9D1D9" w:sz="4"/>
+              <w:bottom w:val="single" w:color="C9D1D9" w:sz="4"/>
+              <w:right w:val="single" w:color="C9D1D9" w:sz="4"/>
+            </w:tcBorders>
+            <w:shd w:fill="FFFFFF" w:color="auto" w:val="clear"/>
+            <w:tcMar>
+              <w:top w:type="dxa" w:w="60"/>
+              <w:left w:type="dxa" w:w="100"/>
+              <w:bottom w:type="dxa" w:w="60"/>
+              <w:right w:type="dxa" w:w="100"/>
+            </w:tcMar>
+          </w:tcPr>
+          <w:p>
+            <w:pPr>
+              <w:spacing w:after="20" w:line="250"/>
+            </w:pPr>
+            <w:r>
+              <w:rPr>
+                <w:sz w:val="18"/>
+                <w:szCs w:val="18"/>
+              </w:rPr>
+              <w:t xml:space="preserve">SP2 có 5/8 review lệch kỳ vọng</w:t>
+            </w:r>
+          </w:p>
+        </w:tc>
+        <w:tc>
+          <w:tcPr>
+            <w:tcW w:type="dxa" w:w="2822"/>
+            <w:tcBorders>
+              <w:top w:val="single" w:color="C9D1D9" w:sz="4"/>
+              <w:left w:val="single" w:color="C9D1D9" w:sz="4"/>
+              <w:bottom w:val="single" w:color="C9D1D9" w:sz="4"/>
+              <w:right w:val="single" w:color="C9D1D9" w:sz="4"/>
+            </w:tcBorders>
+            <w:shd w:fill="FFFFFF" w:color="auto" w:val="clear"/>
+            <w:tcMar>
+              <w:top w:type="dxa" w:w="60"/>
+              <w:left w:type="dxa" w:w="100"/>
+              <w:bottom w:type="dxa" w:w="60"/>
+              <w:right w:type="dxa" w:w="100"/>
+            </w:tcMar>
+          </w:tcPr>
+          <w:p>
+            <w:pPr>
+              <w:spacing w:after="20" w:line="250"/>
+            </w:pPr>
+            <w:r>
+              <w:rPr>
+                <w:sz w:val="18"/>
+                <w:szCs w:val="18"/>
+              </w:rPr>
+              <w:t xml:space="preserve">Cần giữ từ 4,0 trở lên. Đây là thêm một lý do sửa listing SP2 trước khi mua traffic</w:t>
+            </w:r>
+          </w:p>
+        </w:tc>
+      </w:tr>
+      <w:tr>
+        <w:tc>
+          <w:tcPr>
+            <w:tcW w:type="dxa" w:w="1613"/>
+            <w:tcBorders>
+              <w:top w:val="single" w:color="C9D1D9" w:sz="4"/>
+              <w:left w:val="single" w:color="C9D1D9" w:sz="4"/>
+              <w:bottom w:val="single" w:color="C9D1D9" w:sz="4"/>
+              <w:right w:val="single" w:color="C9D1D9" w:sz="4"/>
+            </w:tcBorders>
+            <w:shd w:fill="F6F7F8" w:color="auto" w:val="clear"/>
+            <w:tcMar>
+              <w:top w:type="dxa" w:w="60"/>
+              <w:left w:type="dxa" w:w="100"/>
+              <w:bottom w:type="dxa" w:w="60"/>
+              <w:right w:type="dxa" w:w="100"/>
+            </w:tcMar>
+          </w:tcPr>
+          <w:p>
+            <w:pPr>
+              <w:spacing w:after="20" w:line="250"/>
+            </w:pPr>
+            <w:r>
+              <w:rPr>
+                <w:sz w:val="18"/>
+                <w:szCs w:val="18"/>
+              </w:rPr>
+              <w:t xml:space="preserve">A+ Content và video</w:t>
+            </w:r>
+          </w:p>
+        </w:tc>
+        <w:tc>
+          <w:tcPr>
+            <w:tcW w:type="dxa" w:w="3427"/>
+            <w:tcBorders>
+              <w:top w:val="single" w:color="C9D1D9" w:sz="4"/>
+              <w:left w:val="single" w:color="C9D1D9" w:sz="4"/>
+              <w:bottom w:val="single" w:color="C9D1D9" w:sz="4"/>
+              <w:right w:val="single" w:color="C9D1D9" w:sz="4"/>
+            </w:tcBorders>
+            <w:shd w:fill="F6F7F8" w:color="auto" w:val="clear"/>
+            <w:tcMar>
+              <w:top w:type="dxa" w:w="60"/>
+              <w:left w:type="dxa" w:w="100"/>
+              <w:bottom w:type="dxa" w:w="60"/>
+              <w:right w:type="dxa" w:w="100"/>
+            </w:tcMar>
+          </w:tcPr>
+          <w:p>
+            <w:pPr>
+              <w:spacing w:after="20" w:line="250"/>
+            </w:pPr>
+            <w:r>
+              <w:rPr>
+                <w:sz w:val="18"/>
+                <w:szCs w:val="18"/>
+              </w:rPr>
+              <w:t xml:space="preserve">83% sản phẩm có cả A+ và video, chiếm 90,9% doanh số. Với sản phẩm mới: 95,7% có, chiếm 98,1% doanh số</w:t>
+            </w:r>
+          </w:p>
+        </w:tc>
+        <w:tc>
+          <w:tcPr>
+            <w:tcW w:type="dxa" w:w="2218"/>
+            <w:tcBorders>
+              <w:top w:val="single" w:color="C9D1D9" w:sz="4"/>
+              <w:left w:val="single" w:color="C9D1D9" w:sz="4"/>
+              <w:bottom w:val="single" w:color="C9D1D9" w:sz="4"/>
+              <w:right w:val="single" w:color="C9D1D9" w:sz="4"/>
+            </w:tcBorders>
+            <w:shd w:fill="F6F7F8" w:color="auto" w:val="clear"/>
+            <w:tcMar>
+              <w:top w:type="dxa" w:w="60"/>
+              <w:left w:type="dxa" w:w="100"/>
+              <w:bottom w:type="dxa" w:w="60"/>
+              <w:right w:type="dxa" w:w="100"/>
+            </w:tcMar>
+          </w:tcPr>
+          <w:p>
+            <w:pPr>
+              <w:spacing w:after="20" w:line="250"/>
+            </w:pPr>
+            <w:r>
+              <w:rPr>
+                <w:sz w:val="18"/>
+                <w:szCs w:val="18"/>
+              </w:rPr>
+              <w:t xml:space="preserve">Có Brand Registry nhưng A+ và video chưa khai thác (chưa có câu chuyện NYFW)</w:t>
+            </w:r>
+          </w:p>
+        </w:tc>
+        <w:tc>
+          <w:tcPr>
+            <w:tcW w:type="dxa" w:w="2822"/>
+            <w:tcBorders>
+              <w:top w:val="single" w:color="C9D1D9" w:sz="4"/>
+              <w:left w:val="single" w:color="C9D1D9" w:sz="4"/>
+              <w:bottom w:val="single" w:color="C9D1D9" w:sz="4"/>
+              <w:right w:val="single" w:color="C9D1D9" w:sz="4"/>
+            </w:tcBorders>
+            <w:shd w:fill="F6F7F8" w:color="auto" w:val="clear"/>
+            <w:tcMar>
+              <w:top w:type="dxa" w:w="60"/>
+              <w:left w:type="dxa" w:w="100"/>
+              <w:bottom w:type="dxa" w:w="60"/>
+              <w:right w:type="dxa" w:w="100"/>
+            </w:tcMar>
+          </w:tcPr>
+          <w:p>
+            <w:pPr>
+              <w:spacing w:after="20" w:line="250"/>
+            </w:pPr>
+            <w:r>
+              <w:rPr>
+                <w:sz w:val="18"/>
+                <w:szCs w:val="18"/>
+              </w:rPr>
+              <w:t xml:space="preserve">A+ và video là </w:t>
+            </w:r>
+            <w:r>
+              <w:rPr>
+                <w:b/>
+                <w:bCs/>
+                <w:sz w:val="18"/>
+                <w:szCs w:val="18"/>
+              </w:rPr>
+              <w:t xml:space="preserve">chuẩn tối thiểu của nhóm dẫn đầu</w:t>
+            </w:r>
+            <w:r>
+              <w:rPr>
+                <w:sz w:val="18"/>
+                <w:szCs w:val="18"/>
+              </w:rPr>
+              <w:t xml:space="preserve">. Có chúng chưa bảo đảm vào top, nhưng thiếu chúng thì gần như không có mặt</w:t>
+            </w:r>
+          </w:p>
+        </w:tc>
+      </w:tr>
+      <w:tr>
+        <w:tc>
+          <w:tcPr>
+            <w:tcW w:type="dxa" w:w="1613"/>
+            <w:tcBorders>
+              <w:top w:val="single" w:color="C9D1D9" w:sz="4"/>
+              <w:left w:val="single" w:color="C9D1D9" w:sz="4"/>
+              <w:bottom w:val="single" w:color="C9D1D9" w:sz="4"/>
+              <w:right w:val="single" w:color="C9D1D9" w:sz="4"/>
+            </w:tcBorders>
+            <w:shd w:fill="FFFFFF" w:color="auto" w:val="clear"/>
+            <w:tcMar>
+              <w:top w:type="dxa" w:w="60"/>
+              <w:left w:type="dxa" w:w="100"/>
+              <w:bottom w:type="dxa" w:w="60"/>
+              <w:right w:type="dxa" w:w="100"/>
+            </w:tcMar>
+          </w:tcPr>
+          <w:p>
+            <w:pPr>
+              <w:spacing w:after="20" w:line="250"/>
+            </w:pPr>
+            <w:r>
+              <w:rPr>
+                <w:sz w:val="18"/>
+                <w:szCs w:val="18"/>
+              </w:rPr>
+              <w:t xml:space="preserve">Sản phẩm mới (dưới 6 tháng)</w:t>
+            </w:r>
+          </w:p>
+        </w:tc>
+        <w:tc>
+          <w:tcPr>
+            <w:tcW w:type="dxa" w:w="3427"/>
+            <w:tcBorders>
+              <w:top w:val="single" w:color="C9D1D9" w:sz="4"/>
+              <w:left w:val="single" w:color="C9D1D9" w:sz="4"/>
+              <w:bottom w:val="single" w:color="C9D1D9" w:sz="4"/>
+              <w:right w:val="single" w:color="C9D1D9" w:sz="4"/>
+            </w:tcBorders>
+            <w:shd w:fill="FFFFFF" w:color="auto" w:val="clear"/>
+            <w:tcMar>
+              <w:top w:type="dxa" w:w="60"/>
+              <w:left w:type="dxa" w:w="100"/>
+              <w:bottom w:type="dxa" w:w="60"/>
+              <w:right w:type="dxa" w:w="100"/>
+            </w:tcMar>
+          </w:tcPr>
+          <w:p>
+            <w:pPr>
+              <w:spacing w:after="20" w:line="250"/>
+            </w:pPr>
+            <w:r>
+              <w:rPr>
+                <w:sz w:val="18"/>
+                <w:szCs w:val="18"/>
+              </w:rPr>
+              <w:t xml:space="preserve">23/100 sản phẩm, giá TB 36,77 USD, điểm TB 4,3, TB khoảng 1.718 đánh giá, bán TB khoảng 1.477 chiếc/tháng. 67/100 sản phẩm ra mắt trong 2025–2026</w:t>
+            </w:r>
+          </w:p>
+        </w:tc>
+        <w:tc>
+          <w:tcPr>
+            <w:tcW w:type="dxa" w:w="2218"/>
+            <w:tcBorders>
+              <w:top w:val="single" w:color="C9D1D9" w:sz="4"/>
+              <w:left w:val="single" w:color="C9D1D9" w:sz="4"/>
+              <w:bottom w:val="single" w:color="C9D1D9" w:sz="4"/>
+              <w:right w:val="single" w:color="C9D1D9" w:sz="4"/>
+            </w:tcBorders>
+            <w:shd w:fill="FFFFFF" w:color="auto" w:val="clear"/>
+            <w:tcMar>
+              <w:top w:type="dxa" w:w="60"/>
+              <w:left w:type="dxa" w:w="100"/>
+              <w:bottom w:type="dxa" w:w="60"/>
+              <w:right w:type="dxa" w:w="100"/>
+            </w:tcMar>
+          </w:tcPr>
+          <w:p>
+            <w:pPr>
+              <w:spacing w:after="20" w:line="250"/>
+            </w:pPr>
+            <w:r>
+              <w:rPr>
+                <w:sz w:val="18"/>
+                <w:szCs w:val="18"/>
+              </w:rPr>
+              <w:t xml:space="preserve">SP1 mở bán 03/2026</w:t>
+            </w:r>
+          </w:p>
+        </w:tc>
+        <w:tc>
+          <w:tcPr>
+            <w:tcW w:type="dxa" w:w="2822"/>
+            <w:tcBorders>
+              <w:top w:val="single" w:color="C9D1D9" w:sz="4"/>
+              <w:left w:val="single" w:color="C9D1D9" w:sz="4"/>
+              <w:bottom w:val="single" w:color="C9D1D9" w:sz="4"/>
+              <w:right w:val="single" w:color="C9D1D9" w:sz="4"/>
+            </w:tcBorders>
+            <w:shd w:fill="FFFFFF" w:color="auto" w:val="clear"/>
+            <w:tcMar>
+              <w:top w:type="dxa" w:w="60"/>
+              <w:left w:type="dxa" w:w="100"/>
+              <w:bottom w:type="dxa" w:w="60"/>
+              <w:right w:type="dxa" w:w="100"/>
+            </w:tcMar>
+          </w:tcPr>
+          <w:p>
+            <w:pPr>
+              <w:spacing w:after="20" w:line="250"/>
+            </w:pPr>
+            <w:r>
+              <w:rPr>
+                <w:sz w:val="18"/>
+                <w:szCs w:val="18"/>
+              </w:rPr>
+              <w:t xml:space="preserve">Tuổi listing không phải rào cản. Nhưng sản phẩm mới trong top đã tích lũy review rất nhanh, nên SIXDO cần kế hoạch review ngay từ đầu</w:t>
+            </w:r>
+          </w:p>
+        </w:tc>
+      </w:tr>
+      <w:tr>
+        <w:tc>
+          <w:tcPr>
+            <w:tcW w:type="dxa" w:w="1613"/>
+            <w:tcBorders>
+              <w:top w:val="single" w:color="C9D1D9" w:sz="4"/>
+              <w:left w:val="single" w:color="C9D1D9" w:sz="4"/>
+              <w:bottom w:val="single" w:color="C9D1D9" w:sz="4"/>
+              <w:right w:val="single" w:color="C9D1D9" w:sz="4"/>
+            </w:tcBorders>
+            <w:shd w:fill="F6F7F8" w:color="auto" w:val="clear"/>
+            <w:tcMar>
+              <w:top w:type="dxa" w:w="60"/>
+              <w:left w:type="dxa" w:w="100"/>
+              <w:bottom w:type="dxa" w:w="60"/>
+              <w:right w:type="dxa" w:w="100"/>
+            </w:tcMar>
+          </w:tcPr>
+          <w:p>
+            <w:pPr>
+              <w:spacing w:after="20" w:line="250"/>
+            </w:pPr>
+            <w:r>
+              <w:rPr>
+                <w:sz w:val="18"/>
+                <w:szCs w:val="18"/>
+              </w:rPr>
+              <w:t xml:space="preserve">Mức tập trung</w:t>
+            </w:r>
+          </w:p>
+        </w:tc>
+        <w:tc>
+          <w:tcPr>
+            <w:tcW w:type="dxa" w:w="3427"/>
+            <w:tcBorders>
+              <w:top w:val="single" w:color="C9D1D9" w:sz="4"/>
+              <w:left w:val="single" w:color="C9D1D9" w:sz="4"/>
+              <w:bottom w:val="single" w:color="C9D1D9" w:sz="4"/>
+              <w:right w:val="single" w:color="C9D1D9" w:sz="4"/>
+            </w:tcBorders>
+            <w:shd w:fill="F6F7F8" w:color="auto" w:val="clear"/>
+            <w:tcMar>
+              <w:top w:type="dxa" w:w="60"/>
+              <w:left w:type="dxa" w:w="100"/>
+              <w:bottom w:type="dxa" w:w="60"/>
+              <w:right w:type="dxa" w:w="100"/>
+            </w:tcMar>
+          </w:tcPr>
+          <w:p>
+            <w:pPr>
+              <w:spacing w:after="20" w:line="250"/>
+            </w:pPr>
+            <w:r>
+              <w:rPr>
+                <w:sz w:val="18"/>
+                <w:szCs w:val="18"/>
+              </w:rPr>
+              <w:t xml:space="preserve">Top 10 thương hiệu chiếm 60,7% doanh số (dẫn đầu: Gloria Vanderbilt, PRETTYGARDEN, Zeagoo). Amazon tự bán chiếm khoảng 25%</w:t>
+            </w:r>
+          </w:p>
+        </w:tc>
+        <w:tc>
+          <w:tcPr>
+            <w:tcW w:type="dxa" w:w="2218"/>
+            <w:tcBorders>
+              <w:top w:val="single" w:color="C9D1D9" w:sz="4"/>
+              <w:left w:val="single" w:color="C9D1D9" w:sz="4"/>
+              <w:bottom w:val="single" w:color="C9D1D9" w:sz="4"/>
+              <w:right w:val="single" w:color="C9D1D9" w:sz="4"/>
+            </w:tcBorders>
+            <w:shd w:fill="F6F7F8" w:color="auto" w:val="clear"/>
+            <w:tcMar>
+              <w:top w:type="dxa" w:w="60"/>
+              <w:left w:type="dxa" w:w="100"/>
+              <w:bottom w:type="dxa" w:w="60"/>
+              <w:right w:type="dxa" w:w="100"/>
+            </w:tcMar>
+          </w:tcPr>
+          <w:p>
+            <w:pPr>
+              <w:spacing w:after="20" w:line="250"/>
+            </w:pPr>
+            <w:r>
+              <w:rPr>
+                <w:sz w:val="18"/>
+                <w:szCs w:val="18"/>
+              </w:rPr>
+              <w:t xml:space="preserve">–</w:t>
+            </w:r>
+          </w:p>
+        </w:tc>
+        <w:tc>
+          <w:tcPr>
+            <w:tcW w:type="dxa" w:w="2822"/>
+            <w:tcBorders>
+              <w:top w:val="single" w:color="C9D1D9" w:sz="4"/>
+              <w:left w:val="single" w:color="C9D1D9" w:sz="4"/>
+              <w:bottom w:val="single" w:color="C9D1D9" w:sz="4"/>
+              <w:right w:val="single" w:color="C9D1D9" w:sz="4"/>
+            </w:tcBorders>
+            <w:shd w:fill="F6F7F8" w:color="auto" w:val="clear"/>
+            <w:tcMar>
+              <w:top w:type="dxa" w:w="60"/>
+              <w:left w:type="dxa" w:w="100"/>
+              <w:bottom w:type="dxa" w:w="60"/>
+              <w:right w:type="dxa" w:w="100"/>
+            </w:tcMar>
+          </w:tcPr>
+          <w:p>
+            <w:pPr>
+              <w:spacing w:after="20" w:line="250"/>
+            </w:pPr>
+            <w:r>
+              <w:rPr>
+                <w:sz w:val="18"/>
+                <w:szCs w:val="18"/>
+              </w:rPr>
+              <w:t xml:space="preserve">Thị trường tập trung; SIXDO cạnh tranh theo ngách dịp mặc, không đối đầu toàn danh mục</w:t>
+            </w:r>
+          </w:p>
+        </w:tc>
+      </w:tr>
+      <w:tr>
+        <w:tc>
+          <w:tcPr>
+            <w:tcW w:type="dxa" w:w="1613"/>
+            <w:tcBorders>
+              <w:top w:val="single" w:color="C9D1D9" w:sz="4"/>
+              <w:left w:val="single" w:color="C9D1D9" w:sz="4"/>
+              <w:bottom w:val="single" w:color="C9D1D9" w:sz="4"/>
+              <w:right w:val="single" w:color="C9D1D9" w:sz="4"/>
+            </w:tcBorders>
+            <w:shd w:fill="FFFFFF" w:color="auto" w:val="clear"/>
+            <w:tcMar>
+              <w:top w:type="dxa" w:w="60"/>
+              <w:left w:type="dxa" w:w="100"/>
+              <w:bottom w:type="dxa" w:w="60"/>
+              <w:right w:type="dxa" w:w="100"/>
+            </w:tcMar>
+          </w:tcPr>
+          <w:p>
+            <w:pPr>
+              <w:spacing w:after="20" w:line="250"/>
+            </w:pPr>
+            <w:r>
+              <w:rPr>
+                <w:sz w:val="18"/>
+                <w:szCs w:val="18"/>
+              </w:rPr>
+              <w:t xml:space="preserve">Hoàn tất đơn</w:t>
+            </w:r>
+          </w:p>
+        </w:tc>
+        <w:tc>
+          <w:tcPr>
+            <w:tcW w:type="dxa" w:w="3427"/>
+            <w:tcBorders>
+              <w:top w:val="single" w:color="C9D1D9" w:sz="4"/>
+              <w:left w:val="single" w:color="C9D1D9" w:sz="4"/>
+              <w:bottom w:val="single" w:color="C9D1D9" w:sz="4"/>
+              <w:right w:val="single" w:color="C9D1D9" w:sz="4"/>
+            </w:tcBorders>
+            <w:shd w:fill="FFFFFF" w:color="auto" w:val="clear"/>
+            <w:tcMar>
+              <w:top w:type="dxa" w:w="60"/>
+              <w:left w:type="dxa" w:w="100"/>
+              <w:bottom w:type="dxa" w:w="60"/>
+              <w:right w:type="dxa" w:w="100"/>
+            </w:tcMar>
+          </w:tcPr>
+          <w:p>
+            <w:pPr>
+              <w:spacing w:after="20" w:line="250"/>
+            </w:pPr>
+            <w:r>
+              <w:rPr>
+                <w:sz w:val="18"/>
+                <w:szCs w:val="18"/>
+              </w:rPr>
+              <w:t xml:space="preserve">87% sản phẩm dùng FBA (khoảng 74% doanh số; phần còn lại do Amazon tự bán)</w:t>
+            </w:r>
+          </w:p>
+        </w:tc>
+        <w:tc>
+          <w:tcPr>
+            <w:tcW w:type="dxa" w:w="2218"/>
+            <w:tcBorders>
+              <w:top w:val="single" w:color="C9D1D9" w:sz="4"/>
+              <w:left w:val="single" w:color="C9D1D9" w:sz="4"/>
+              <w:bottom w:val="single" w:color="C9D1D9" w:sz="4"/>
+              <w:right w:val="single" w:color="C9D1D9" w:sz="4"/>
+            </w:tcBorders>
+            <w:shd w:fill="FFFFFF" w:color="auto" w:val="clear"/>
+            <w:tcMar>
+              <w:top w:type="dxa" w:w="60"/>
+              <w:left w:type="dxa" w:w="100"/>
+              <w:bottom w:type="dxa" w:w="60"/>
+              <w:right w:type="dxa" w:w="100"/>
+            </w:tcMar>
+          </w:tcPr>
+          <w:p>
+            <w:pPr>
+              <w:spacing w:after="20" w:line="250"/>
+            </w:pPr>
+            <w:r>
+              <w:rPr>
+                <w:sz w:val="18"/>
+                <w:szCs w:val="18"/>
+              </w:rPr>
+              <w:t xml:space="preserve">FBA (theo đề bài)</w:t>
+            </w:r>
+          </w:p>
+        </w:tc>
+        <w:tc>
+          <w:tcPr>
+            <w:tcW w:type="dxa" w:w="2822"/>
+            <w:tcBorders>
+              <w:top w:val="single" w:color="C9D1D9" w:sz="4"/>
+              <w:left w:val="single" w:color="C9D1D9" w:sz="4"/>
+              <w:bottom w:val="single" w:color="C9D1D9" w:sz="4"/>
+              <w:right w:val="single" w:color="C9D1D9" w:sz="4"/>
+            </w:tcBorders>
+            <w:shd w:fill="FFFFFF" w:color="auto" w:val="clear"/>
+            <w:tcMar>
+              <w:top w:type="dxa" w:w="60"/>
+              <w:left w:type="dxa" w:w="100"/>
+              <w:bottom w:type="dxa" w:w="60"/>
+              <w:right w:type="dxa" w:w="100"/>
+            </w:tcMar>
+          </w:tcPr>
+          <w:p>
+            <w:pPr>
+              <w:spacing w:after="20" w:line="250"/>
+            </w:pPr>
+            <w:r>
+              <w:rPr>
+                <w:sz w:val="18"/>
+                <w:szCs w:val="18"/>
+              </w:rPr>
+              <w:t xml:space="preserve">Đạt chuẩn</w:t>
+            </w:r>
+          </w:p>
+        </w:tc>
+      </w:tr>
+    </w:tbl>
     <w:tbl>
       <w:tblPr>
         <w:tblW w:type="dxa" w:w="10080"/>
@@ -11873,7 +13616,7 @@
           <w:sz w:val="17"/>
           <w:szCs w:val="17"/>
         </w:rPr>
-        <w:t xml:space="preserve">●● cửa sổ chính · ● cửa sổ phụ. Căn cứ: lịch dịp ở mục 1.1.4 và đỉnh Google Trends của từng truy vấn.</w:t>
+        <w:t xml:space="preserve">●● cửa sổ chính · ● cửa sổ phụ. Căn cứ: lịch dịp ở mục 1.1.5, doanh số theo tháng ở mục 1.1.2 và đỉnh Google Trends của từng truy vấn.</w:t>
       </w:r>
     </w:p>
     <w:p>
@@ -14000,6 +15743,130 @@
                 <w:sz w:val="18"/>
                 <w:szCs w:val="18"/>
               </w:rPr>
+              <w:t xml:space="preserve">Tháng 10 đã tăng khoảng 67% so với tháng 9; Q1 còn khoảng 70% Q4</w:t>
+            </w:r>
+          </w:p>
+        </w:tc>
+        <w:tc>
+          <w:tcPr>
+            <w:tcW w:type="dxa" w:w="5544"/>
+            <w:tcBorders>
+              <w:top w:val="single" w:color="C9D1D9" w:sz="4"/>
+              <w:left w:val="single" w:color="C9D1D9" w:sz="4"/>
+              <w:bottom w:val="single" w:color="C9D1D9" w:sz="4"/>
+              <w:right w:val="single" w:color="C9D1D9" w:sz="4"/>
+            </w:tcBorders>
+            <w:shd w:fill="FFFFFF" w:color="auto" w:val="clear"/>
+            <w:tcMar>
+              <w:top w:type="dxa" w:w="60"/>
+              <w:left w:type="dxa" w:w="100"/>
+              <w:bottom w:type="dxa" w:w="60"/>
+              <w:right w:type="dxa" w:w="100"/>
+            </w:tcMar>
+          </w:tcPr>
+          <w:p>
+            <w:pPr>
+              <w:spacing w:after="20" w:line="250"/>
+            </w:pPr>
+            <w:r>
+              <w:rPr>
+                <w:sz w:val="18"/>
+                <w:szCs w:val="18"/>
+              </w:rPr>
+              <w:t xml:space="preserve">Listing mới phải xong trong tuần đầu tháng 10; giữ một phần ngân sách cho nhịp tháng 3</w:t>
+            </w:r>
+          </w:p>
+        </w:tc>
+      </w:tr>
+      <w:tr>
+        <w:tc>
+          <w:tcPr>
+            <w:tcW w:type="dxa" w:w="4536"/>
+            <w:tcBorders>
+              <w:top w:val="single" w:color="C9D1D9" w:sz="4"/>
+              <w:left w:val="single" w:color="C9D1D9" w:sz="4"/>
+              <w:bottom w:val="single" w:color="C9D1D9" w:sz="4"/>
+              <w:right w:val="single" w:color="C9D1D9" w:sz="4"/>
+            </w:tcBorders>
+            <w:shd w:fill="F6F7F8" w:color="auto" w:val="clear"/>
+            <w:tcMar>
+              <w:top w:type="dxa" w:w="60"/>
+              <w:left w:type="dxa" w:w="100"/>
+              <w:bottom w:type="dxa" w:w="60"/>
+              <w:right w:type="dxa" w:w="100"/>
+            </w:tcMar>
+          </w:tcPr>
+          <w:p>
+            <w:pPr>
+              <w:spacing w:after="20" w:line="250"/>
+            </w:pPr>
+            <w:r>
+              <w:rPr>
+                <w:sz w:val="18"/>
+                <w:szCs w:val="18"/>
+              </w:rPr>
+              <w:t xml:space="preserve">91% doanh số Best Seller có A+ và video; 75% thuộc sản phẩm trên 500 đánh giá</w:t>
+            </w:r>
+          </w:p>
+        </w:tc>
+        <w:tc>
+          <w:tcPr>
+            <w:tcW w:type="dxa" w:w="5544"/>
+            <w:tcBorders>
+              <w:top w:val="single" w:color="C9D1D9" w:sz="4"/>
+              <w:left w:val="single" w:color="C9D1D9" w:sz="4"/>
+              <w:bottom w:val="single" w:color="C9D1D9" w:sz="4"/>
+              <w:right w:val="single" w:color="C9D1D9" w:sz="4"/>
+            </w:tcBorders>
+            <w:shd w:fill="F6F7F8" w:color="auto" w:val="clear"/>
+            <w:tcMar>
+              <w:top w:type="dxa" w:w="60"/>
+              <w:left w:type="dxa" w:w="100"/>
+              <w:bottom w:type="dxa" w:w="60"/>
+              <w:right w:type="dxa" w:w="100"/>
+            </w:tcMar>
+          </w:tcPr>
+          <w:p>
+            <w:pPr>
+              <w:spacing w:after="20" w:line="250"/>
+            </w:pPr>
+            <w:r>
+              <w:rPr>
+                <w:sz w:val="18"/>
+                <w:szCs w:val="18"/>
+              </w:rPr>
+              <w:t xml:space="preserve">A+ (có câu chuyện NYFW) và video là chuẩn tối thiểu; có kế hoạch tích lũy review sớm</w:t>
+            </w:r>
+          </w:p>
+        </w:tc>
+      </w:tr>
+      <w:tr>
+        <w:tc>
+          <w:tcPr>
+            <w:tcW w:type="dxa" w:w="4536"/>
+            <w:tcBorders>
+              <w:top w:val="single" w:color="C9D1D9" w:sz="4"/>
+              <w:left w:val="single" w:color="C9D1D9" w:sz="4"/>
+              <w:bottom w:val="single" w:color="C9D1D9" w:sz="4"/>
+              <w:right w:val="single" w:color="C9D1D9" w:sz="4"/>
+            </w:tcBorders>
+            <w:shd w:fill="FFFFFF" w:color="auto" w:val="clear"/>
+            <w:tcMar>
+              <w:top w:type="dxa" w:w="60"/>
+              <w:left w:type="dxa" w:w="100"/>
+              <w:bottom w:type="dxa" w:w="60"/>
+              <w:right w:type="dxa" w:w="100"/>
+            </w:tcMar>
+          </w:tcPr>
+          <w:p>
+            <w:pPr>
+              <w:spacing w:after="20" w:line="250"/>
+            </w:pPr>
+            <w:r>
+              <w:rPr>
+                <w:sz w:val="18"/>
+                <w:szCs w:val="18"/>
+              </w:rPr>
               <w:t xml:space="preserve">Một dịp mua lớn gần như mỗi tháng</w:t>
             </w:r>
           </w:p>
@@ -14151,7 +16018,27 @@
         <w:t xml:space="preserve">Helium 10:</w:t>
       </w:r>
       <w:r>
-        <w:t xml:space="preserve"> Amazon US, search volume ước tính 30 ngày gần nhất, ghi ngày 29/09/2026. 11 từ khóa có volume được trình bày ở mục 1.1.3.</w:t>
+        <w:t xml:space="preserve"> Amazon US, search volume ước tính 30 ngày gần nhất, ghi ngày 29/09/2026. 11 từ khóa có volume được trình bày ở mục 1.1.4.</w:t>
+      </w:r>
+    </w:p>
+    <w:p>
+      <w:pPr>
+        <w:pStyle w:val="ListParagraph"/>
+        <w:numPr>
+          <w:ilvl w:val="0"/>
+          <w:numId w:val="2"/>
+        </w:numPr>
+        <w:spacing w:after="60" w:line="264"/>
+      </w:pPr>
+      <w:r>
+        <w:rPr>
+          <w:b/>
+          <w:bCs/>
+        </w:rPr>
+        <w:t xml:space="preserve">SellerSprite, Best Seller Market Analysis:</w:t>
+      </w:r>
+      <w:r>
+        <w:t xml:space="preserve"> 100 sản phẩm trong top Best Seller Amazon US (báo cáo không ghi danh mục; theo thương hiệu là thời trang nữ nói chung), xuất tháng 09/2026. Mẫu chỉ gồm sản phẩm đang ở top, nên doanh số các tháng cũ bị đánh giá thấp. Doanh số, doanh thu và biên lợi nhuận là ước tính của công cụ. Doanh số theo tháng đọc từ biểu đồ và làm tròn.</w:t>
       </w:r>
     </w:p>
     <w:p>
@@ -14233,7 +16120,7 @@
         </w:rPr>
         <w:t xml:space="preserve">[1] Adobe – Holiday season 2024 recap. </w:t>
       </w:r>
-      <w:hyperlink w:history="1" r:id="rIdzvkkrmbdjvk6ciyx5dpsp">
+      <w:hyperlink w:history="1" r:id="rIdswmvxe3_6j7a7ekw6sl3m">
         <w:r>
           <w:rPr>
             <w:color w:val="2A78D6"/>
@@ -14256,7 +16143,7 @@
         </w:rPr>
         <w:t xml:space="preserve">[2] Adobe – Holiday shopping season 2025 (PDF, 07/01/2026). </w:t>
       </w:r>
-      <w:hyperlink w:history="1" r:id="rIdhnzryots2rk9cxpmnuua4">
+      <w:hyperlink w:history="1" r:id="rIdx0fjg2o04pvue6erujm1d">
         <w:r>
           <w:rPr>
             <w:color w:val="2A78D6"/>
@@ -14279,7 +16166,7 @@
         </w:rPr>
         <w:t xml:space="preserve">[3] Adobe – U.S. holiday shopping season forecast 2026 (28/09/2026). </w:t>
       </w:r>
-      <w:hyperlink w:history="1" r:id="rId-n4vixyt0_lx6b-g4g_yg">
+      <w:hyperlink w:history="1" r:id="rIdkhuu7rcqib7fa9upjtmj8">
         <w:r>
           <w:rPr>
             <w:color w:val="2A78D6"/>
@@ -14302,7 +16189,7 @@
         </w:rPr>
         <w:t xml:space="preserve">[4] Momentum Commerce – Amazon Clothing, Shoes &amp; Jewelry forecast 2024. </w:t>
       </w:r>
-      <w:hyperlink w:history="1" r:id="rIdgelfexhf9mr7ntbejozp0">
+      <w:hyperlink w:history="1" r:id="rIdjrownniujpwpdbglox9fk">
         <w:r>
           <w:rPr>
             <w:color w:val="2A78D6"/>
@@ -14325,7 +16212,7 @@
         </w:rPr>
         <w:t xml:space="preserve">[5] PYMNTS Intelligence – Amazon's apparel dominance (2025). </w:t>
       </w:r>
-      <w:hyperlink w:history="1" r:id="rIdnfcin6l-xhi71ulnbvf5o">
+      <w:hyperlink w:history="1" r:id="rIdksfp2aqlr30nginldzcpr">
         <w:r>
           <w:rPr>
             <w:color w:val="2A78D6"/>
@@ -14348,7 +16235,7 @@
         </w:rPr>
         <w:t xml:space="preserve">[6] About Amazon – Prime Big Deal Days 2026: October 6–7. </w:t>
       </w:r>
-      <w:hyperlink w:history="1" r:id="rIdmirs4krhmnlxlmlgxpkkn">
+      <w:hyperlink w:history="1" r:id="rIdc8rhrev-983gskjitm9v_">
         <w:r>
           <w:rPr>
             <w:color w:val="2A78D6"/>
@@ -14371,7 +16258,7 @@
         </w:rPr>
         <w:t xml:space="preserve">[7] The Knot – Wedding seasons (tháng 6 và tháng 10 cùng 16%). </w:t>
       </w:r>
-      <w:hyperlink w:history="1" r:id="rIdj_iw5ek9jakq1xsvrtgmp">
+      <w:hyperlink w:history="1" r:id="rIdjloffwfn0abf8-gc5bmoo">
         <w:r>
           <w:rPr>
             <w:color w:val="2A78D6"/>
@@ -14394,7 +16281,7 @@
         </w:rPr>
         <w:t xml:space="preserve">[8] Challenger, Gray &amp; Christmas – Holiday party survey 2024 (173 công ty). </w:t>
       </w:r>
-      <w:hyperlink w:history="1" r:id="rIdr2akmatuf_y8qhyhfcdem">
+      <w:hyperlink w:history="1" r:id="rIdrpsjxlpkxx13ignvio-rc">
         <w:r>
           <w:rPr>
             <w:color w:val="2A78D6"/>
@@ -14417,7 +16304,7 @@
         </w:rPr>
         <w:t xml:space="preserve">[9] NRF – Holiday gift survey 2025. </w:t>
       </w:r>
-      <w:hyperlink w:history="1" r:id="rIds00pgqdnnn0axecipo9x3">
+      <w:hyperlink w:history="1" r:id="rIdkhdqaqpbyb12iqyj_smpn">
         <w:r>
           <w:rPr>
             <w:color w:val="2A78D6"/>
@@ -14440,7 +16327,7 @@
         </w:rPr>
         <w:t xml:space="preserve">[10] CLIA – 2026 State of the Cruise Industry. </w:t>
       </w:r>
-      <w:hyperlink w:history="1" r:id="rIdc85zuosd0k0lr8iwhfbms">
+      <w:hyperlink w:history="1" r:id="rIdkkyyjitxkt5eknzqpartm">
         <w:r>
           <w:rPr>
             <w:color w:val="2A78D6"/>
@@ -14463,7 +16350,7 @@
         </w:rPr>
         <w:t xml:space="preserve">[11] NRF – Valentine's Day spending 2026. </w:t>
       </w:r>
-      <w:hyperlink w:history="1" r:id="rIdpqpcxul15hvdgo19ndcun">
+      <w:hyperlink w:history="1" r:id="rIdtbwvqbhxx_auhjmv3192p">
         <w:r>
           <w:rPr>
             <w:color w:val="2A78D6"/>
@@ -14486,7 +16373,7 @@
         </w:rPr>
         <w:t xml:space="preserve">[12] VnExpress International – Vietnamese designer makes NYFW debut. </w:t>
       </w:r>
-      <w:hyperlink w:history="1" r:id="rIdbvh58myudtopqw-si3q-7">
+      <w:hyperlink w:history="1" r:id="rIdx99yjcmbpqrl9swzsgvoc">
         <w:r>
           <w:rPr>
             <w:color w:val="2A78D6"/>
@@ -14509,7 +16396,7 @@
         </w:rPr>
         <w:t xml:space="preserve">[13] Kisau – SIXDO: Rose motifs on Rodeo Drive (04/2025). </w:t>
       </w:r>
-      <w:hyperlink w:history="1" r:id="rIdok8cun1ljf45vappcepr0">
+      <w:hyperlink w:history="1" r:id="rIdiwfio5nmgdjusiogzwxke">
         <w:r>
           <w:rPr>
             <w:color w:val="2A78D6"/>
@@ -14532,7 +16419,7 @@
         </w:rPr>
         <w:t xml:space="preserve">[14] AAA – Cruise forecast 2026. </w:t>
       </w:r>
-      <w:hyperlink w:history="1" r:id="rIdnplfb-poc8uqbkslf1edy">
+      <w:hyperlink w:history="1" r:id="rIdvesbtk0lasszqma7libyf">
         <w:r>
           <w:rPr>
             <w:color w:val="2A78D6"/>
@@ -14555,7 +16442,7 @@
         </w:rPr>
         <w:t xml:space="preserve">[15] Allianz Partners – 2025 Holiday travel survey (điểm đến mùa lễ). </w:t>
       </w:r>
-      <w:hyperlink w:history="1" r:id="rId1fsy_i0yxx98fqw1ievab">
+      <w:hyperlink w:history="1" r:id="rIdhdcvekzpdmy4_zczzfhwv">
         <w:r>
           <w:rPr>
             <w:color w:val="2A78D6"/>
@@ -14578,7 +16465,7 @@
         </w:rPr>
         <w:t xml:space="preserve">[16] Deloitte – 2025 Holiday travel survey. </w:t>
       </w:r>
-      <w:hyperlink w:history="1" r:id="rIdvgwh76e74ioplh2wkqicd">
+      <w:hyperlink w:history="1" r:id="rIdx0u_x9ja8ghm6ottfjooo">
         <w:r>
           <w:rPr>
             <w:color w:val="2A78D6"/>
@@ -14601,7 +16488,7 @@
         </w:rPr>
         <w:t xml:space="preserve">[17] Stitch Fix – Holiday dressing research. </w:t>
       </w:r>
-      <w:hyperlink w:history="1" r:id="rId-6mewbkhvdpis7xmjhpqk">
+      <w:hyperlink w:history="1" r:id="rIdgfwwpdprffqyjulkxmmut">
         <w:r>
           <w:rPr>
             <w:color w:val="2A78D6"/>
@@ -14624,7 +16511,7 @@
         </w:rPr>
         <w:t xml:space="preserve">[18] Google Trends Help – Data normalization. </w:t>
       </w:r>
-      <w:hyperlink w:history="1" r:id="rId19zmq4ibbydwt1xgqby5r">
+      <w:hyperlink w:history="1" r:id="rIdkanxpchyccp3vmwvlm5aj">
         <w:r>
           <w:rPr>
             <w:color w:val="2A78D6"/>

</xml_diff>